<commit_message>
Report: cite the Federal Register copy of the FTC Valassis analysis (old FTC link moved)
Co-authored-by: Harshita Adlakha <242173464+HarshitaAdlakha@users.noreply.github.com>
</commit_message>
<xml_diff>
--- a/report/Sting-report.docx
+++ b/report/Sting-report.docx
@@ -2899,7 +2899,7 @@
         <w:rPr>
           <w:rFonts w:ascii="Old Standard TT" w:hAnsi="Old Standard TT"/>
         </w:rPr>
-        <w:t>• Other artifacts: project page and video walkthrough at https://parasadlakha.github.io/sting/. The work has no info-hazard beyond what is discussed in Appendix A.</w:t>
+        <w:t>• Other artifacts: project page and video walkthrough: https://parasadlakha.github.io/sting/ (the work has no info-hazard beyond what is discussed in Appendix A).</w:t>
       </w:r>
     </w:p>
     <w:p>
@@ -3000,7 +3000,20 @@
         <w:rPr>
           <w:rFonts w:ascii="Old Standard TT" w:hAnsi="Old Standard TT"/>
         </w:rPr>
-        <w:t>• Federal Trade Commission 2006. In the Matter of Valassis Communications, Inc., File No. 051-0008, complaint and analysis to aid public comment. https://www.ftc.gov/sites/default/files/documents/cases/2006/03/060314ana0510008.pdf</w:t>
+        <w:t xml:space="preserve">• Federal Trade Commission 2006. Valassis Communications, Inc.; Analysis of Agreement Containing Consent Order to Aid Public Comment, File No. 051-0008. </w:t>
+      </w:r>
+      <w:r>
+        <w:rPr>
+          <w:rFonts w:ascii="Old Standard TT" w:hAnsi="Old Standard TT"/>
+          <w:i/>
+        </w:rPr>
+        <w:t>Federal Register</w:t>
+      </w:r>
+      <w:r>
+        <w:rPr>
+          <w:rFonts w:ascii="Old Standard TT" w:hAnsi="Old Standard TT"/>
+        </w:rPr>
+        <w:t xml:space="preserve"> 71(53), 20 March 2006. https://www.govinfo.gov/content/pkg/FR-2006-03-20/html/E6-3965.htm</w:t>
       </w:r>
     </w:p>
     <w:p>

</xml_diff>